<commit_message>
Update downloadable CV (add portfolio link)
</commit_message>
<xml_diff>
--- a/Dita_Shahihah_CV.docx
+++ b/Dita_Shahihah_CV.docx
@@ -73,6 +73,24 @@
           <w:t>shahihah</w:t>
         </w:r>
         <w:proofErr w:type="spellEnd"/>
+      </w:hyperlink>
+      <w:r>
+        <w:rPr>
+          <w:rFonts w:ascii="Arial" w:hAnsi="Arial"/>
+          <w:sz w:val="19"/>
+        </w:rPr>
+        <w:t xml:space="preserve">  |  Portfolio: </w:t>
+      </w:r>
+      <w:hyperlink r:id="rId12">
+        <w:r>
+          <w:rPr>
+            <w:rFonts w:ascii="Arial" w:hAnsi="Arial"/>
+            <w:color w:val="0563C1"/>
+            <w:u w:val="single"/>
+            <w:sz w:val="19"/>
+          </w:rPr>
+          <w:t xml:space="preserve">ditashahihah.github.io/portfolio-web</w:t>
+        </w:r>
       </w:hyperlink>
     </w:p>
     <w:p>

</xml_diff>